<commit_message>
Pin Gemini model IDs and update run commands
Replaces `*-latest` aliases with pinned model IDs (`gemini-3.8-flash` and `gemini-3.5-flash-lite`) across agent defaults, eval config, FinOps pricing/cost scripts, and environment templates to avoid Agent Platform global-endpoint 404s. Also updates activation/web startup commands in scripts and teaching docs so both Cloud Shell tabs source `activate.sh`, and aligns course/teleprompter content with the new model names and M6 cost-comparison flow.
</commit_message>
<xml_diff>
--- a/docs/PLANNING GUIDE - AgentOps on Google Cloud.docx
+++ b/docs/PLANNING GUIDE - AgentOps on Google Cloud.docx
@@ -458,10 +458,10 @@
         </w:tblBorders>
       </w:tblPr>
       <w:tblGrid>
-        <w:gridCol w:w="690"/>
-        <w:gridCol w:w="790"/>
-        <w:gridCol w:w="4540"/>
-        <w:gridCol w:w="4060"/>
+        <w:gridCol w:w="680"/>
+        <w:gridCol w:w="780"/>
+        <w:gridCol w:w="4590"/>
+        <w:gridCol w:w="4030"/>
       </w:tblGrid>
       <w:tr>
         <w:trPr>
@@ -469,7 +469,7 @@
         </w:trPr>
         <w:tc>
           <w:tcPr>
-            <w:tcW w:type="dxa" w:w="690"/>
+            <w:tcW w:type="dxa" w:w="680"/>
             <w:tcBorders>
               <w:top w:val="single" w:color="9AA4B2" w:sz="4"/>
               <w:left w:val="single" w:color="9AA4B2" w:sz="4"/>
@@ -504,7 +504,7 @@
         </w:tc>
         <w:tc>
           <w:tcPr>
-            <w:tcW w:type="dxa" w:w="790"/>
+            <w:tcW w:type="dxa" w:w="780"/>
             <w:tcBorders>
               <w:top w:val="single" w:color="9AA4B2" w:sz="4"/>
               <w:left w:val="single" w:color="9AA4B2" w:sz="4"/>
@@ -539,7 +539,7 @@
         </w:tc>
         <w:tc>
           <w:tcPr>
-            <w:tcW w:type="dxa" w:w="4540"/>
+            <w:tcW w:type="dxa" w:w="4590"/>
             <w:tcBorders>
               <w:top w:val="single" w:color="9AA4B2" w:sz="4"/>
               <w:left w:val="single" w:color="9AA4B2" w:sz="4"/>
@@ -574,7 +574,7 @@
         </w:tc>
         <w:tc>
           <w:tcPr>
-            <w:tcW w:type="dxa" w:w="4060"/>
+            <w:tcW w:type="dxa" w:w="4030"/>
             <w:tcBorders>
               <w:top w:val="single" w:color="9AA4B2" w:sz="4"/>
               <w:left w:val="single" w:color="9AA4B2" w:sz="4"/>
@@ -614,7 +614,7 @@
         </w:trPr>
         <w:tc>
           <w:tcPr>
-            <w:tcW w:type="dxa" w:w="690"/>
+            <w:tcW w:type="dxa" w:w="680"/>
             <w:tcBorders>
               <w:top w:val="single" w:color="9AA4B2" w:sz="4"/>
               <w:left w:val="single" w:color="9AA4B2" w:sz="4"/>
@@ -648,7 +648,7 @@
         </w:tc>
         <w:tc>
           <w:tcPr>
-            <w:tcW w:type="dxa" w:w="790"/>
+            <w:tcW w:type="dxa" w:w="780"/>
             <w:tcBorders>
               <w:top w:val="single" w:color="9AA4B2" w:sz="4"/>
               <w:left w:val="single" w:color="9AA4B2" w:sz="4"/>
@@ -682,7 +682,7 @@
         </w:tc>
         <w:tc>
           <w:tcPr>
-            <w:tcW w:type="dxa" w:w="4540"/>
+            <w:tcW w:type="dxa" w:w="4590"/>
             <w:tcBorders>
               <w:top w:val="single" w:color="9AA4B2" w:sz="4"/>
               <w:left w:val="single" w:color="9AA4B2" w:sz="4"/>
@@ -716,7 +716,7 @@
         </w:tc>
         <w:tc>
           <w:tcPr>
-            <w:tcW w:type="dxa" w:w="4060"/>
+            <w:tcW w:type="dxa" w:w="4030"/>
             <w:tcBorders>
               <w:top w:val="single" w:color="9AA4B2" w:sz="4"/>
               <w:left w:val="single" w:color="9AA4B2" w:sz="4"/>
@@ -755,7 +755,7 @@
         </w:trPr>
         <w:tc>
           <w:tcPr>
-            <w:tcW w:type="dxa" w:w="690"/>
+            <w:tcW w:type="dxa" w:w="680"/>
             <w:tcBorders>
               <w:top w:val="single" w:color="9AA4B2" w:sz="4"/>
               <w:left w:val="single" w:color="9AA4B2" w:sz="4"/>
@@ -789,7 +789,7 @@
         </w:tc>
         <w:tc>
           <w:tcPr>
-            <w:tcW w:type="dxa" w:w="790"/>
+            <w:tcW w:type="dxa" w:w="780"/>
             <w:tcBorders>
               <w:top w:val="single" w:color="9AA4B2" w:sz="4"/>
               <w:left w:val="single" w:color="9AA4B2" w:sz="4"/>
@@ -823,7 +823,7 @@
         </w:tc>
         <w:tc>
           <w:tcPr>
-            <w:tcW w:type="dxa" w:w="4540"/>
+            <w:tcW w:type="dxa" w:w="4590"/>
             <w:tcBorders>
               <w:top w:val="single" w:color="9AA4B2" w:sz="4"/>
               <w:left w:val="single" w:color="9AA4B2" w:sz="4"/>
@@ -857,7 +857,7 @@
         </w:tc>
         <w:tc>
           <w:tcPr>
-            <w:tcW w:type="dxa" w:w="4060"/>
+            <w:tcW w:type="dxa" w:w="4030"/>
             <w:tcBorders>
               <w:top w:val="single" w:color="9AA4B2" w:sz="4"/>
               <w:left w:val="single" w:color="9AA4B2" w:sz="4"/>
@@ -896,7 +896,7 @@
         </w:trPr>
         <w:tc>
           <w:tcPr>
-            <w:tcW w:type="dxa" w:w="690"/>
+            <w:tcW w:type="dxa" w:w="680"/>
             <w:tcBorders>
               <w:top w:val="single" w:color="9AA4B2" w:sz="4"/>
               <w:left w:val="single" w:color="9AA4B2" w:sz="4"/>
@@ -930,7 +930,7 @@
         </w:tc>
         <w:tc>
           <w:tcPr>
-            <w:tcW w:type="dxa" w:w="790"/>
+            <w:tcW w:type="dxa" w:w="780"/>
             <w:tcBorders>
               <w:top w:val="single" w:color="9AA4B2" w:sz="4"/>
               <w:left w:val="single" w:color="9AA4B2" w:sz="4"/>
@@ -964,7 +964,7 @@
         </w:tc>
         <w:tc>
           <w:tcPr>
-            <w:tcW w:type="dxa" w:w="4540"/>
+            <w:tcW w:type="dxa" w:w="4590"/>
             <w:tcBorders>
               <w:top w:val="single" w:color="9AA4B2" w:sz="4"/>
               <w:left w:val="single" w:color="9AA4B2" w:sz="4"/>
@@ -998,7 +998,7 @@
         </w:tc>
         <w:tc>
           <w:tcPr>
-            <w:tcW w:type="dxa" w:w="4060"/>
+            <w:tcW w:type="dxa" w:w="4030"/>
             <w:tcBorders>
               <w:top w:val="single" w:color="9AA4B2" w:sz="4"/>
               <w:left w:val="single" w:color="9AA4B2" w:sz="4"/>
@@ -1037,7 +1037,7 @@
         </w:trPr>
         <w:tc>
           <w:tcPr>
-            <w:tcW w:type="dxa" w:w="690"/>
+            <w:tcW w:type="dxa" w:w="680"/>
             <w:tcBorders>
               <w:top w:val="single" w:color="9AA4B2" w:sz="4"/>
               <w:left w:val="single" w:color="9AA4B2" w:sz="4"/>
@@ -1071,7 +1071,7 @@
         </w:tc>
         <w:tc>
           <w:tcPr>
-            <w:tcW w:type="dxa" w:w="790"/>
+            <w:tcW w:type="dxa" w:w="780"/>
             <w:tcBorders>
               <w:top w:val="single" w:color="9AA4B2" w:sz="4"/>
               <w:left w:val="single" w:color="9AA4B2" w:sz="4"/>
@@ -1105,7 +1105,7 @@
         </w:tc>
         <w:tc>
           <w:tcPr>
-            <w:tcW w:type="dxa" w:w="4540"/>
+            <w:tcW w:type="dxa" w:w="4590"/>
             <w:tcBorders>
               <w:top w:val="single" w:color="9AA4B2" w:sz="4"/>
               <w:left w:val="single" w:color="9AA4B2" w:sz="4"/>
@@ -1139,7 +1139,7 @@
         </w:tc>
         <w:tc>
           <w:tcPr>
-            <w:tcW w:type="dxa" w:w="4060"/>
+            <w:tcW w:type="dxa" w:w="4030"/>
             <w:tcBorders>
               <w:top w:val="single" w:color="9AA4B2" w:sz="4"/>
               <w:left w:val="single" w:color="9AA4B2" w:sz="4"/>
@@ -1178,7 +1178,7 @@
         </w:trPr>
         <w:tc>
           <w:tcPr>
-            <w:tcW w:type="dxa" w:w="690"/>
+            <w:tcW w:type="dxa" w:w="680"/>
             <w:tcBorders>
               <w:top w:val="single" w:color="9AA4B2" w:sz="4"/>
               <w:left w:val="single" w:color="9AA4B2" w:sz="4"/>
@@ -1212,7 +1212,7 @@
         </w:tc>
         <w:tc>
           <w:tcPr>
-            <w:tcW w:type="dxa" w:w="790"/>
+            <w:tcW w:type="dxa" w:w="780"/>
             <w:tcBorders>
               <w:top w:val="single" w:color="9AA4B2" w:sz="4"/>
               <w:left w:val="single" w:color="9AA4B2" w:sz="4"/>
@@ -1246,7 +1246,7 @@
         </w:tc>
         <w:tc>
           <w:tcPr>
-            <w:tcW w:type="dxa" w:w="4540"/>
+            <w:tcW w:type="dxa" w:w="4590"/>
             <w:tcBorders>
               <w:top w:val="single" w:color="9AA4B2" w:sz="4"/>
               <w:left w:val="single" w:color="9AA4B2" w:sz="4"/>
@@ -1280,7 +1280,7 @@
         </w:tc>
         <w:tc>
           <w:tcPr>
-            <w:tcW w:type="dxa" w:w="4060"/>
+            <w:tcW w:type="dxa" w:w="4030"/>
             <w:tcBorders>
               <w:top w:val="single" w:color="9AA4B2" w:sz="4"/>
               <w:left w:val="single" w:color="9AA4B2" w:sz="4"/>
@@ -1319,7 +1319,7 @@
         </w:trPr>
         <w:tc>
           <w:tcPr>
-            <w:tcW w:type="dxa" w:w="690"/>
+            <w:tcW w:type="dxa" w:w="680"/>
             <w:tcBorders>
               <w:top w:val="single" w:color="9AA4B2" w:sz="4"/>
               <w:left w:val="single" w:color="9AA4B2" w:sz="4"/>
@@ -1353,7 +1353,7 @@
         </w:tc>
         <w:tc>
           <w:tcPr>
-            <w:tcW w:type="dxa" w:w="790"/>
+            <w:tcW w:type="dxa" w:w="780"/>
             <w:tcBorders>
               <w:top w:val="single" w:color="9AA4B2" w:sz="4"/>
               <w:left w:val="single" w:color="9AA4B2" w:sz="4"/>
@@ -1387,41 +1387,41 @@
         </w:tc>
         <w:tc>
           <w:tcPr>
-            <w:tcW w:type="dxa" w:w="4540"/>
-            <w:tcBorders>
-              <w:top w:val="single" w:color="9AA4B2" w:sz="4"/>
-              <w:left w:val="single" w:color="9AA4B2" w:sz="4"/>
-              <w:bottom w:val="single" w:color="9AA4B2" w:sz="4"/>
-              <w:right w:val="single" w:color="9AA4B2" w:sz="4"/>
-            </w:tcBorders>
-            <w:tcMar>
-              <w:top w:type="dxa" w:w="50"/>
-              <w:left w:type="dxa" w:w="90"/>
-              <w:bottom w:type="dxa" w:w="50"/>
-              <w:right w:type="dxa" w:w="90"/>
-            </w:tcMar>
-          </w:tcPr>
-          <w:p>
-            <w:pPr>
-              <w:spacing w:after="0" w:before="0"/>
-            </w:pPr>
-            <w:r>
-              <w:rPr>
-                <w:rFonts w:ascii="Calibri" w:cs="Calibri" w:eastAsia="Calibri" w:hAnsi="Calibri"/>
-                <w:b w:val="false"/>
-                <w:bCs w:val="false"/>
-                <w:i w:val="false"/>
-                <w:iCs w:val="false"/>
-                <w:sz w:val="19"/>
-                <w:szCs w:val="19"/>
-              </w:rPr>
-              <w:t xml:space="preserve">Cost per turn per model; eval on flash-lite</w:t>
-            </w:r>
-          </w:p>
-        </w:tc>
-        <w:tc>
-          <w:tcPr>
-            <w:tcW w:type="dxa" w:w="4060"/>
+            <w:tcW w:type="dxa" w:w="4590"/>
+            <w:tcBorders>
+              <w:top w:val="single" w:color="9AA4B2" w:sz="4"/>
+              <w:left w:val="single" w:color="9AA4B2" w:sz="4"/>
+              <w:bottom w:val="single" w:color="9AA4B2" w:sz="4"/>
+              <w:right w:val="single" w:color="9AA4B2" w:sz="4"/>
+            </w:tcBorders>
+            <w:tcMar>
+              <w:top w:type="dxa" w:w="50"/>
+              <w:left w:type="dxa" w:w="90"/>
+              <w:bottom w:type="dxa" w:w="50"/>
+              <w:right w:type="dxa" w:w="90"/>
+            </w:tcMar>
+          </w:tcPr>
+          <w:p>
+            <w:pPr>
+              <w:spacing w:after="0" w:before="0"/>
+            </w:pPr>
+            <w:r>
+              <w:rPr>
+                <w:rFonts w:ascii="Calibri" w:cs="Calibri" w:eastAsia="Calibri" w:hAnsi="Calibri"/>
+                <w:b w:val="false"/>
+                <w:bCs w:val="false"/>
+                <w:i w:val="false"/>
+                <w:iCs w:val="false"/>
+                <w:sz w:val="19"/>
+                <w:szCs w:val="19"/>
+              </w:rPr>
+              <w:t xml:space="preserve">Cost per turn per model; eval on 3.5 Flash-Lite</w:t>
+            </w:r>
+          </w:p>
+        </w:tc>
+        <w:tc>
+          <w:tcPr>
+            <w:tcW w:type="dxa" w:w="4030"/>
             <w:tcBorders>
               <w:top w:val="single" w:color="9AA4B2" w:sz="4"/>
               <w:left w:val="single" w:color="9AA4B2" w:sz="4"/>
@@ -3231,7 +3231,7 @@
           <w:sz w:val="22"/>
           <w:szCs w:val="22"/>
         </w:rPr>
-        <w:t xml:space="preserve">Then: in block 8 (M6), skip the flash-lite eval and say what it would show.</w:t>
+        <w:t xml:space="preserve">Then: in block 8 (M6), skip the Flash-Lite eval and say what it would show.</w:t>
       </w:r>
     </w:p>
     <w:p>
@@ -3749,7 +3749,7 @@
           <w:sz w:val="22"/>
           <w:szCs w:val="22"/>
         </w:rPr>
-        <w:t xml:space="preserve">TAB 1: adk web running, diabetes_agent selected, Token Streaming OFF. TAB 2: source ~/agentops/activate.sh</w:t>
+        <w:t xml:space="preserve">TAB 1: source ~/agentops/activate.sh &amp;&amp; cd ~/agentops &amp;&amp; adk web --reload_agents --allow_origins "*"  (diabetes_agent selected, Token Streaming OFF). TAB 2: source ~/agentops/activate.sh</w:t>
       </w:r>
     </w:p>
     <w:p>
@@ -4175,7 +4175,7 @@
                 <w:sz w:val="21"/>
                 <w:szCs w:val="21"/>
               </w:rPr>
-              <w:t xml:space="preserve">TAB 1: cd ~/agentops &amp;&amp; adk web --reload_agents --allow_origins "*"</w:t>
+              <w:t xml:space="preserve">TAB 1: source ~/agentops/activate.sh &amp;&amp; cd ~/agentops &amp;&amp; adk web --reload_agents --allow_origins "*"</w:t>
             </w:r>
           </w:p>
           <w:p>
@@ -5382,7 +5382,7 @@
                 <w:sz w:val="19"/>
                 <w:szCs w:val="19"/>
               </w:rPr>
-              <w:t xml:space="preserve">GOOGLE_CLOUD_LOCATION=global (model) · PROJECT_ID · AGENT_MODEL=gemini-flash-latest</w:t>
+              <w:t xml:space="preserve">GOOGLE_CLOUD_LOCATION=global (model) · PROJECT_ID · AGENT_MODEL=gemini-3.8-flash</w:t>
             </w:r>
           </w:p>
         </w:tc>
@@ -11596,7 +11596,7 @@
           <w:sz w:val="22"/>
           <w:szCs w:val="22"/>
         </w:rPr>
-        <w:t xml:space="preserve">Prices are list prices for the standard tier as of yesterday. The -latest aliases move when Google ships a new model, which is exactly why you pin a version for production and re-run the eval when you change it.</w:t>
+        <w:t xml:space="preserve">Prices are list prices for the standard tier as of yesterday. We pin exact model IDs, 3.8 Flash and 3.5 Flash-Lite, and re-run the eval whenever we change one. That is the right-sizing loop.</w:t>
       </w:r>
     </w:p>
     <w:p>
@@ -11916,7 +11916,7 @@
                 <w:sz w:val="19"/>
                 <w:szCs w:val="19"/>
               </w:rPr>
-              <w:t xml:space="preserve">Two tables (flash, flash-lite): 3–6 model calls per turn, the search questions include sub-agent calls, $ per turn ▸ last line: flash-lite costs ~N% of flash (2–3 min)</w:t>
+              <w:t xml:space="preserve">Two tables (3.8 Flash, 3.5 Flash-Lite): 3–6 model calls per turn, the search questions include sub-agent calls, $ per turn ▸ last line: 3.5-flash-lite costs ~N% of 3.8-flash (2–3 min)</w:t>
             </w:r>
           </w:p>
         </w:tc>
@@ -12096,7 +12096,7 @@
                 <w:sz w:val="19"/>
                 <w:szCs w:val="19"/>
               </w:rPr>
-              <w:t xml:space="preserve">cd ~/agentops &amp;&amp; AGENT_MODEL=gemini-flash-lite-latest adk eval diabetes_agent diabetes_agent/agentops_baseline.evalset.json \</w:t>
+              <w:t xml:space="preserve">cd ~/agentops &amp;&amp; AGENT_MODEL=gemini-3.5-flash-lite adk eval diabetes_agent diabetes_agent/agentops_baseline.evalset.json \</w:t>
             </w:r>
           </w:p>
           <w:p>
@@ -13267,7 +13267,7 @@
                 <w:sz w:val="19"/>
                 <w:szCs w:val="19"/>
               </w:rPr>
-              <w:t xml:space="preserve">Model</w:t>
+              <w:t xml:space="preserve">Models</w:t>
             </w:r>
           </w:p>
         </w:tc>
@@ -13301,7 +13301,7 @@
                 <w:sz w:val="19"/>
                 <w:szCs w:val="19"/>
               </w:rPr>
-              <w:t xml:space="preserve">gemini-flash-latest (AGENT_MODEL), served from global</w:t>
+              <w:t xml:space="preserve">gemini-3.8-flash (AGENT_MODEL) · gemini-3.5-flash-lite (LITE_MODEL, M6) · both on global</w:t>
             </w:r>
           </w:p>
         </w:tc>
@@ -13951,10 +13951,10 @@
         </w:tblBorders>
       </w:tblPr>
       <w:tblGrid>
-        <w:gridCol w:w="2710"/>
-        <w:gridCol w:w="4530"/>
-        <w:gridCol w:w="1350"/>
-        <w:gridCol w:w="1490"/>
+        <w:gridCol w:w="2460"/>
+        <w:gridCol w:w="4680"/>
+        <w:gridCol w:w="1400"/>
+        <w:gridCol w:w="1540"/>
       </w:tblGrid>
       <w:tr>
         <w:trPr>
@@ -13962,7 +13962,7 @@
         </w:trPr>
         <w:tc>
           <w:tcPr>
-            <w:tcW w:type="dxa" w:w="2710"/>
+            <w:tcW w:type="dxa" w:w="2460"/>
             <w:tcBorders>
               <w:top w:val="single" w:color="9AA4B2" w:sz="4"/>
               <w:left w:val="single" w:color="9AA4B2" w:sz="4"/>
@@ -13997,7 +13997,7 @@
         </w:tc>
         <w:tc>
           <w:tcPr>
-            <w:tcW w:type="dxa" w:w="4530"/>
+            <w:tcW w:type="dxa" w:w="4680"/>
             <w:tcBorders>
               <w:top w:val="single" w:color="9AA4B2" w:sz="4"/>
               <w:left w:val="single" w:color="9AA4B2" w:sz="4"/>
@@ -14032,7 +14032,7 @@
         </w:tc>
         <w:tc>
           <w:tcPr>
-            <w:tcW w:type="dxa" w:w="1350"/>
+            <w:tcW w:type="dxa" w:w="1400"/>
             <w:tcBorders>
               <w:top w:val="single" w:color="9AA4B2" w:sz="4"/>
               <w:left w:val="single" w:color="9AA4B2" w:sz="4"/>
@@ -14067,7 +14067,7 @@
         </w:tc>
         <w:tc>
           <w:tcPr>
-            <w:tcW w:type="dxa" w:w="1490"/>
+            <w:tcW w:type="dxa" w:w="1540"/>
             <w:tcBorders>
               <w:top w:val="single" w:color="9AA4B2" w:sz="4"/>
               <w:left w:val="single" w:color="9AA4B2" w:sz="4"/>
@@ -14107,41 +14107,41 @@
         </w:trPr>
         <w:tc>
           <w:tcPr>
-            <w:tcW w:type="dxa" w:w="2710"/>
-            <w:tcBorders>
-              <w:top w:val="single" w:color="9AA4B2" w:sz="4"/>
-              <w:left w:val="single" w:color="9AA4B2" w:sz="4"/>
-              <w:bottom w:val="single" w:color="9AA4B2" w:sz="4"/>
-              <w:right w:val="single" w:color="9AA4B2" w:sz="4"/>
-            </w:tcBorders>
-            <w:tcMar>
-              <w:top w:type="dxa" w:w="50"/>
-              <w:left w:type="dxa" w:w="90"/>
-              <w:bottom w:type="dxa" w:w="50"/>
-              <w:right w:type="dxa" w:w="90"/>
-            </w:tcMar>
-          </w:tcPr>
-          <w:p>
-            <w:pPr>
-              <w:spacing w:after="0" w:before="0"/>
-            </w:pPr>
-            <w:r>
-              <w:rPr>
-                <w:rFonts w:ascii="Calibri" w:cs="Calibri" w:eastAsia="Calibri" w:hAnsi="Calibri"/>
-                <w:b w:val="false"/>
-                <w:bCs w:val="false"/>
-                <w:i w:val="false"/>
-                <w:iCs w:val="false"/>
-                <w:sz w:val="19"/>
-                <w:szCs w:val="19"/>
-              </w:rPr>
-              <w:t xml:space="preserve">gemini-flash-latest</w:t>
-            </w:r>
-          </w:p>
-        </w:tc>
-        <w:tc>
-          <w:tcPr>
-            <w:tcW w:type="dxa" w:w="4530"/>
+            <w:tcW w:type="dxa" w:w="2460"/>
+            <w:tcBorders>
+              <w:top w:val="single" w:color="9AA4B2" w:sz="4"/>
+              <w:left w:val="single" w:color="9AA4B2" w:sz="4"/>
+              <w:bottom w:val="single" w:color="9AA4B2" w:sz="4"/>
+              <w:right w:val="single" w:color="9AA4B2" w:sz="4"/>
+            </w:tcBorders>
+            <w:tcMar>
+              <w:top w:type="dxa" w:w="50"/>
+              <w:left w:type="dxa" w:w="90"/>
+              <w:bottom w:type="dxa" w:w="50"/>
+              <w:right w:type="dxa" w:w="90"/>
+            </w:tcMar>
+          </w:tcPr>
+          <w:p>
+            <w:pPr>
+              <w:spacing w:after="0" w:before="0"/>
+            </w:pPr>
+            <w:r>
+              <w:rPr>
+                <w:rFonts w:ascii="Calibri" w:cs="Calibri" w:eastAsia="Calibri" w:hAnsi="Calibri"/>
+                <w:b w:val="false"/>
+                <w:bCs w:val="false"/>
+                <w:i w:val="false"/>
+                <w:iCs w:val="false"/>
+                <w:sz w:val="19"/>
+                <w:szCs w:val="19"/>
+              </w:rPr>
+              <w:t xml:space="preserve">gemini-3.8-flash</w:t>
+            </w:r>
+          </w:p>
+        </w:tc>
+        <w:tc>
+          <w:tcPr>
+            <w:tcW w:type="dxa" w:w="4680"/>
             <w:tcBorders>
               <w:top w:val="single" w:color="9AA4B2" w:sz="4"/>
               <w:left w:val="single" w:color="9AA4B2" w:sz="4"/>
@@ -14175,7 +14175,7 @@
         </w:tc>
         <w:tc>
           <w:tcPr>
-            <w:tcW w:type="dxa" w:w="1350"/>
+            <w:tcW w:type="dxa" w:w="1400"/>
             <w:tcBorders>
               <w:top w:val="single" w:color="9AA4B2" w:sz="4"/>
               <w:left w:val="single" w:color="9AA4B2" w:sz="4"/>
@@ -14209,7 +14209,7 @@
         </w:tc>
         <w:tc>
           <w:tcPr>
-            <w:tcW w:type="dxa" w:w="1490"/>
+            <w:tcW w:type="dxa" w:w="1540"/>
             <w:tcBorders>
               <w:top w:val="single" w:color="9AA4B2" w:sz="4"/>
               <w:left w:val="single" w:color="9AA4B2" w:sz="4"/>
@@ -14248,41 +14248,41 @@
         </w:trPr>
         <w:tc>
           <w:tcPr>
-            <w:tcW w:type="dxa" w:w="2710"/>
-            <w:tcBorders>
-              <w:top w:val="single" w:color="9AA4B2" w:sz="4"/>
-              <w:left w:val="single" w:color="9AA4B2" w:sz="4"/>
-              <w:bottom w:val="single" w:color="9AA4B2" w:sz="4"/>
-              <w:right w:val="single" w:color="9AA4B2" w:sz="4"/>
-            </w:tcBorders>
-            <w:tcMar>
-              <w:top w:type="dxa" w:w="50"/>
-              <w:left w:type="dxa" w:w="90"/>
-              <w:bottom w:type="dxa" w:w="50"/>
-              <w:right w:type="dxa" w:w="90"/>
-            </w:tcMar>
-          </w:tcPr>
-          <w:p>
-            <w:pPr>
-              <w:spacing w:after="0" w:before="0"/>
-            </w:pPr>
-            <w:r>
-              <w:rPr>
-                <w:rFonts w:ascii="Calibri" w:cs="Calibri" w:eastAsia="Calibri" w:hAnsi="Calibri"/>
-                <w:b w:val="false"/>
-                <w:bCs w:val="false"/>
-                <w:i w:val="false"/>
-                <w:iCs w:val="false"/>
-                <w:sz w:val="19"/>
-                <w:szCs w:val="19"/>
-              </w:rPr>
-              <w:t xml:space="preserve">gemini-flash-lite-latest</w:t>
-            </w:r>
-          </w:p>
-        </w:tc>
-        <w:tc>
-          <w:tcPr>
-            <w:tcW w:type="dxa" w:w="4530"/>
+            <w:tcW w:type="dxa" w:w="2460"/>
+            <w:tcBorders>
+              <w:top w:val="single" w:color="9AA4B2" w:sz="4"/>
+              <w:left w:val="single" w:color="9AA4B2" w:sz="4"/>
+              <w:bottom w:val="single" w:color="9AA4B2" w:sz="4"/>
+              <w:right w:val="single" w:color="9AA4B2" w:sz="4"/>
+            </w:tcBorders>
+            <w:tcMar>
+              <w:top w:type="dxa" w:w="50"/>
+              <w:left w:type="dxa" w:w="90"/>
+              <w:bottom w:type="dxa" w:w="50"/>
+              <w:right w:type="dxa" w:w="90"/>
+            </w:tcMar>
+          </w:tcPr>
+          <w:p>
+            <w:pPr>
+              <w:spacing w:after="0" w:before="0"/>
+            </w:pPr>
+            <w:r>
+              <w:rPr>
+                <w:rFonts w:ascii="Calibri" w:cs="Calibri" w:eastAsia="Calibri" w:hAnsi="Calibri"/>
+                <w:b w:val="false"/>
+                <w:bCs w:val="false"/>
+                <w:i w:val="false"/>
+                <w:iCs w:val="false"/>
+                <w:sz w:val="19"/>
+                <w:szCs w:val="19"/>
+              </w:rPr>
+              <w:t xml:space="preserve">gemini-3.5-flash-lite</w:t>
+            </w:r>
+          </w:p>
+        </w:tc>
+        <w:tc>
+          <w:tcPr>
+            <w:tcW w:type="dxa" w:w="4680"/>
             <w:tcBorders>
               <w:top w:val="single" w:color="9AA4B2" w:sz="4"/>
               <w:left w:val="single" w:color="9AA4B2" w:sz="4"/>
@@ -14316,7 +14316,7 @@
         </w:tc>
         <w:tc>
           <w:tcPr>
-            <w:tcW w:type="dxa" w:w="1350"/>
+            <w:tcW w:type="dxa" w:w="1400"/>
             <w:tcBorders>
               <w:top w:val="single" w:color="9AA4B2" w:sz="4"/>
               <w:left w:val="single" w:color="9AA4B2" w:sz="4"/>
@@ -14350,7 +14350,7 @@
         </w:tc>
         <w:tc>
           <w:tcPr>
-            <w:tcW w:type="dxa" w:w="1490"/>
+            <w:tcW w:type="dxa" w:w="1540"/>
             <w:tcBorders>
               <w:top w:val="single" w:color="9AA4B2" w:sz="4"/>
               <w:left w:val="single" w:color="9AA4B2" w:sz="4"/>
@@ -15241,6 +15241,113 @@
                 <w:sz w:val="19"/>
                 <w:szCs w:val="19"/>
               </w:rPr>
+              <w:t xml:space="preserve">Oct 5</w:t>
+            </w:r>
+          </w:p>
+        </w:tc>
+        <w:tc>
+          <w:tcPr>
+            <w:tcW w:type="dxa" w:w="3900"/>
+            <w:tcBorders>
+              <w:top w:val="single" w:color="9AA4B2" w:sz="4"/>
+              <w:left w:val="single" w:color="9AA4B2" w:sz="4"/>
+              <w:bottom w:val="single" w:color="9AA4B2" w:sz="4"/>
+              <w:right w:val="single" w:color="9AA4B2" w:sz="4"/>
+            </w:tcBorders>
+            <w:tcMar>
+              <w:top w:type="dxa" w:w="50"/>
+              <w:left w:type="dxa" w:w="90"/>
+              <w:bottom w:type="dxa" w:w="50"/>
+              <w:right w:type="dxa" w:w="90"/>
+            </w:tcMar>
+          </w:tcPr>
+          <w:p>
+            <w:pPr>
+              <w:spacing w:after="0" w:before="0"/>
+            </w:pPr>
+            <w:r>
+              <w:rPr>
+                <w:rFonts w:ascii="Calibri" w:cs="Calibri" w:eastAsia="Calibri" w:hAnsi="Calibri"/>
+                <w:b w:val="false"/>
+                <w:bCs w:val="false"/>
+                <w:i w:val="false"/>
+                <w:iCs w:val="false"/>
+                <w:sz w:val="19"/>
+                <w:szCs w:val="19"/>
+              </w:rPr>
+              <w:t xml:space="preserve">Dry run: gemini-flash-latest returns 404 on Agent Platform's global endpoint (it is a Gemini Developer API alias). The pack pins gemini-3.8-flash and gemini-3.5-flash-lite; 3.6 and 3.7 Flash are being removed.</w:t>
+            </w:r>
+          </w:p>
+        </w:tc>
+        <w:tc>
+          <w:tcPr>
+            <w:tcW w:type="dxa" w:w="5280"/>
+            <w:tcBorders>
+              <w:top w:val="single" w:color="9AA4B2" w:sz="4"/>
+              <w:left w:val="single" w:color="9AA4B2" w:sz="4"/>
+              <w:bottom w:val="single" w:color="9AA4B2" w:sz="4"/>
+              <w:right w:val="single" w:color="9AA4B2" w:sz="4"/>
+            </w:tcBorders>
+            <w:tcMar>
+              <w:top w:type="dxa" w:w="50"/>
+              <w:left w:type="dxa" w:w="90"/>
+              <w:bottom w:type="dxa" w:w="50"/>
+              <w:right w:type="dxa" w:w="90"/>
+            </w:tcMar>
+          </w:tcPr>
+          <w:p>
+            <w:pPr>
+              <w:spacing w:after="0" w:before="0"/>
+            </w:pPr>
+            <w:r>
+              <w:rPr>
+                <w:rFonts w:ascii="Calibri" w:cs="Calibri" w:eastAsia="Calibri" w:hAnsi="Calibri"/>
+                <w:b w:val="false"/>
+                <w:bCs w:val="false"/>
+                <w:i w:val="false"/>
+                <w:iCs w:val="false"/>
+                <w:sz w:val="19"/>
+                <w:szCs w:val="19"/>
+              </w:rPr>
+              <w:t xml:space="preserve">All blocks; say it if students copy -latest from Gemini API samples.</w:t>
+            </w:r>
+          </w:p>
+        </w:tc>
+      </w:tr>
+      <w:tr>
+        <w:trPr>
+          <w:cantSplit/>
+        </w:trPr>
+        <w:tc>
+          <w:tcPr>
+            <w:tcW w:type="dxa" w:w="900"/>
+            <w:tcBorders>
+              <w:top w:val="single" w:color="9AA4B2" w:sz="4"/>
+              <w:left w:val="single" w:color="9AA4B2" w:sz="4"/>
+              <w:bottom w:val="single" w:color="9AA4B2" w:sz="4"/>
+              <w:right w:val="single" w:color="9AA4B2" w:sz="4"/>
+            </w:tcBorders>
+            <w:tcMar>
+              <w:top w:type="dxa" w:w="50"/>
+              <w:left w:type="dxa" w:w="90"/>
+              <w:bottom w:type="dxa" w:w="50"/>
+              <w:right w:type="dxa" w:w="90"/>
+            </w:tcMar>
+          </w:tcPr>
+          <w:p>
+            <w:pPr>
+              <w:spacing w:after="0" w:before="0"/>
+            </w:pPr>
+            <w:r>
+              <w:rPr>
+                <w:rFonts w:ascii="Calibri" w:cs="Calibri" w:eastAsia="Calibri" w:hAnsi="Calibri"/>
+                <w:b w:val="false"/>
+                <w:bCs w:val="false"/>
+                <w:i w:val="false"/>
+                <w:iCs w:val="false"/>
+                <w:sz w:val="19"/>
+                <w:szCs w:val="19"/>
+              </w:rPr>
               <w:t xml:space="preserve">Oct 16</w:t>
             </w:r>
           </w:p>
@@ -16082,7 +16189,7 @@
           <w:sz w:val="22"/>
           <w:szCs w:val="22"/>
         </w:rPr>
-        <w:t xml:space="preserve">gemini-flash-lite-latest works on the global endpoint; cost_per_turn.py prints a 'served as' model version.</w:t>
+        <w:t xml:space="preserve">cost_per_turn.py runs both models and prints a 'served as' model version (both IDs returned 200 on the global endpoint in the dry run).</w:t>
       </w:r>
     </w:p>
     <w:p>

</xml_diff>

<commit_message>
Add evalset curation workflow for ADK evals
Introduces `04-evaluate/curate_evalset.py` to turn ADK web-recorded evalsets into stable regression tests by preserving only the first key tool choice per turn (`execute_sql` or `search_agent`) and backing up the original recording. Updates README, teleprompter docs, and demo content to explain why Eval tab defaults fail on reruns, add the curation CLI step, and align expected evaluation timing/results with `04-evaluate/test_config.json`.
</commit_message>
<xml_diff>
--- a/docs/PLANNING GUIDE - AgentOps on Google Cloud.docx
+++ b/docs/PLANNING GUIDE - AgentOps on Google Cloud.docx
@@ -7563,6 +7563,36 @@
     </w:p>
     <w:p>
       <w:pPr>
+        <w:spacing w:after="80" w:before="40" w:line="264"/>
+      </w:pPr>
+      <w:r>
+        <w:rPr>
+          <w:rFonts w:ascii="Calibri" w:cs="Calibri" w:eastAsia="Calibri" w:hAnsi="Calibri"/>
+          <w:b/>
+          <w:bCs/>
+          <w:i w:val="false"/>
+          <w:iCs w:val="false"/>
+          <w:color w:val="2BB3B1"/>
+          <w:sz w:val="20"/>
+          <w:szCs w:val="20"/>
+        </w:rPr>
+        <w:t xml:space="preserve">SAY  </w:t>
+      </w:r>
+      <w:r>
+        <w:rPr>
+          <w:rFonts w:ascii="Calibri" w:cs="Calibri" w:eastAsia="Calibri" w:hAnsi="Calibri"/>
+          <w:b w:val="false"/>
+          <w:bCs w:val="false"/>
+          <w:i/>
+          <w:iCs/>
+          <w:sz w:val="22"/>
+          <w:szCs w:val="22"/>
+        </w:rPr>
+        <w:t xml:space="preserve">But a recording is too literal to be a test. It says 'call get_table_info, then run exactly this SQL, then say exactly these words'. Run it again and the model takes a slightly different, equally correct route, and a strict check fails. Step 3 on slide 32 is edit and refine: decide what actually matters. For us it's one decision per question: did it go to BigQuery or to search first.</w:t>
+      </w:r>
+    </w:p>
+    <w:p>
+      <w:pPr>
         <w:spacing w:after="40" w:before="40" w:line="264"/>
       </w:pPr>
       <w:r>
@@ -8275,7 +8305,7 @@
                 <w:sz w:val="19"/>
                 <w:szCs w:val="19"/>
               </w:rPr>
-              <w:t xml:space="preserve">The question, tool_uses: execute_sql (with its SQL), the final response.</w:t>
+              <w:t xml:space="preserve">Everything it did: maybe get_table_info, then execute_sql with its exact SQL, then the answer.</w:t>
             </w:r>
           </w:p>
         </w:tc>
@@ -8296,344 +8326,6 @@
           <w:szCs w:val="22"/>
         </w:rPr>
         <w:t xml:space="preserve"/>
-      </w:r>
-    </w:p>
-    <w:p>
-      <w:pPr>
-        <w:spacing w:after="80" w:before="40" w:line="264"/>
-      </w:pPr>
-      <w:r>
-        <w:rPr>
-          <w:rFonts w:ascii="Calibri" w:cs="Calibri" w:eastAsia="Calibri" w:hAnsi="Calibri"/>
-          <w:b w:val="false"/>
-          <w:bCs w:val="false"/>
-          <w:i w:val="false"/>
-          <w:iCs w:val="false"/>
-          <w:sz w:val="22"/>
-          <w:szCs w:val="22"/>
-        </w:rPr>
-        <w:t xml:space="preserve">The evalset lands in diabetes_agent/agentops_live.evalset.json (adk web keeps evalsets next to the agent).</w:t>
-      </w:r>
-    </w:p>
-    <w:p>
-      <w:pPr>
-        <w:spacing w:after="80" w:before="40" w:line="264"/>
-      </w:pPr>
-      <w:r>
-        <w:rPr>
-          <w:rFonts w:ascii="Calibri" w:cs="Calibri" w:eastAsia="Calibri" w:hAnsi="Calibri"/>
-          <w:b w:val="false"/>
-          <w:bCs w:val="false"/>
-          <w:i w:val="false"/>
-          <w:iCs w:val="false"/>
-          <w:sz w:val="22"/>
-          <w:szCs w:val="22"/>
-        </w:rPr>
-        <w:t xml:space="preserve">Slide 33's advice applies: these three are happy-path cases. Real evalsets add edge cases and the failures you find in production.</w:t>
-      </w:r>
-    </w:p>
-    <w:p>
-      <w:pPr>
-        <w:spacing w:after="80" w:before="40" w:line="264"/>
-      </w:pPr>
-      <w:r>
-        <w:rPr>
-          <w:rFonts w:ascii="Calibri" w:cs="Calibri" w:eastAsia="Calibri" w:hAnsi="Calibri"/>
-          <w:b/>
-          <w:bCs/>
-          <w:i w:val="false"/>
-          <w:iCs w:val="false"/>
-          <w:color w:val="FF5C5C"/>
-          <w:sz w:val="20"/>
-          <w:szCs w:val="20"/>
-        </w:rPr>
-        <w:t xml:space="preserve">GOTCHA  </w:t>
-      </w:r>
-      <w:r>
-        <w:rPr>
-          <w:rFonts w:ascii="Calibri" w:cs="Calibri" w:eastAsia="Calibri" w:hAnsi="Calibri"/>
-          <w:b w:val="false"/>
-          <w:bCs w:val="false"/>
-          <w:i w:val="false"/>
-          <w:iCs w:val="false"/>
-          <w:sz w:val="20"/>
-          <w:szCs w:val="20"/>
-        </w:rPr>
-        <w:t xml:space="preserve">No Eval tab or the add fails: skip to the next block and use the fallback evalset shipped in 04-evaluate/.</w:t>
-      </w:r>
-    </w:p>
-    <w:p>
-      <w:pPr>
-        <w:pStyle w:val="Heading3"/>
-        <w:keepNext/>
-        <w:spacing w:after="40" w:before="160"/>
-      </w:pPr>
-      <w:r>
-        <w:rPr>
-          <w:rFonts w:ascii="Calibri" w:cs="Calibri" w:eastAsia="Calibri" w:hAnsi="Calibri"/>
-          <w:b/>
-          <w:bCs/>
-          <w:i w:val="false"/>
-          <w:iCs w:val="false"/>
-          <w:color w:val="3D8BFF"/>
-          <w:sz w:val="22"/>
-          <w:szCs w:val="22"/>
-        </w:rPr>
-        <w:t xml:space="preserve">5. Run it, then let it catch a 'harmless' prompt edit   ·   M4 · SLIDES 35–38   ·   ~8 min</w:t>
-      </w:r>
-    </w:p>
-    <w:p>
-      <w:pPr>
-        <w:spacing w:after="80" w:before="40" w:line="264"/>
-      </w:pPr>
-      <w:r>
-        <w:rPr>
-          <w:rFonts w:ascii="Calibri" w:cs="Calibri" w:eastAsia="Calibri" w:hAnsi="Calibri"/>
-          <w:b/>
-          <w:bCs/>
-          <w:i w:val="false"/>
-          <w:iCs w:val="false"/>
-          <w:color w:val="2ECC71"/>
-          <w:sz w:val="20"/>
-          <w:szCs w:val="20"/>
-        </w:rPr>
-        <w:t xml:space="preserve">WHY  </w:t>
-      </w:r>
-      <w:r>
-        <w:rPr>
-          <w:rFonts w:ascii="Calibri" w:cs="Calibri" w:eastAsia="Calibri" w:hAnsi="Calibri"/>
-          <w:b w:val="false"/>
-          <w:bCs w:val="false"/>
-          <w:i w:val="false"/>
-          <w:iCs w:val="false"/>
-          <w:sz w:val="22"/>
-          <w:szCs w:val="22"/>
-        </w:rPr>
-        <w:t xml:space="preserve">Monday takeaway: a prompt is code. A one-paragraph change can reroute tools, and only an eval that checks the trajectory will notice. That eval is the gate on slide 38.</w:t>
-      </w:r>
-    </w:p>
-    <w:p>
-      <w:pPr>
-        <w:spacing w:after="80" w:before="40" w:line="264"/>
-      </w:pPr>
-      <w:r>
-        <w:rPr>
-          <w:rFonts w:ascii="Calibri" w:cs="Calibri" w:eastAsia="Calibri" w:hAnsi="Calibri"/>
-          <w:b/>
-          <w:bCs/>
-          <w:i w:val="false"/>
-          <w:iCs w:val="false"/>
-          <w:color w:val="2BB3B1"/>
-          <w:sz w:val="20"/>
-          <w:szCs w:val="20"/>
-        </w:rPr>
-        <w:t xml:space="preserve">SAY  </w:t>
-      </w:r>
-      <w:r>
-        <w:rPr>
-          <w:rFonts w:ascii="Calibri" w:cs="Calibri" w:eastAsia="Calibri" w:hAnsi="Calibri"/>
-          <w:b w:val="false"/>
-          <w:bCs w:val="false"/>
-          <w:i/>
-          <w:iCs/>
-          <w:sz w:val="22"/>
-          <w:szCs w:val="22"/>
-        </w:rPr>
-        <w:t xml:space="preserve">The default trajectory check compares tool arguments exactly. Our agent writes its own SQL, so the text changes run to run. I check the tool names in any order and ignore the arguments, and I add one rubric an LLM judge scores: did it give the medical disclaimer.</w:t>
-      </w:r>
-    </w:p>
-    <w:p>
-      <w:pPr>
-        <w:spacing w:after="80" w:before="40" w:line="264"/>
-      </w:pPr>
-      <w:r>
-        <w:rPr>
-          <w:rFonts w:ascii="Calibri" w:cs="Calibri" w:eastAsia="Calibri" w:hAnsi="Calibri"/>
-          <w:b/>
-          <w:bCs/>
-          <w:i w:val="false"/>
-          <w:iCs w:val="false"/>
-          <w:color w:val="2BB3B1"/>
-          <w:sz w:val="20"/>
-          <w:szCs w:val="20"/>
-        </w:rPr>
-        <w:t xml:space="preserve">SAY  </w:t>
-      </w:r>
-      <w:r>
-        <w:rPr>
-          <w:rFonts w:ascii="Calibri" w:cs="Calibri" w:eastAsia="Calibri" w:hAnsi="Calibri"/>
-          <w:b w:val="false"/>
-          <w:bCs w:val="false"/>
-          <w:i/>
-          <w:iCs/>
-          <w:sz w:val="22"/>
-          <w:szCs w:val="22"/>
-        </w:rPr>
-        <w:t xml:space="preserve">Now a teammate saves us money: BigQuery costs something on every call, so they tell the agent to answer statistics from search. Look at the diff. Would you have approved it?</w:t>
-      </w:r>
-    </w:p>
-    <w:p>
-      <w:pPr>
-        <w:spacing w:after="80" w:before="40" w:line="264"/>
-      </w:pPr>
-      <w:r>
-        <w:rPr>
-          <w:rFonts w:ascii="Calibri" w:cs="Calibri" w:eastAsia="Calibri" w:hAnsi="Calibri"/>
-          <w:b/>
-          <w:bCs/>
-          <w:i w:val="false"/>
-          <w:iCs w:val="false"/>
-          <w:color w:val="2BB3B1"/>
-          <w:sz w:val="20"/>
-          <w:szCs w:val="20"/>
-        </w:rPr>
-        <w:t xml:space="preserve">SAY  </w:t>
-      </w:r>
-      <w:r>
-        <w:rPr>
-          <w:rFonts w:ascii="Calibri" w:cs="Calibri" w:eastAsia="Calibri" w:hAnsi="Calibri"/>
-          <w:b w:val="false"/>
-          <w:bCs w:val="false"/>
-          <w:i/>
-          <w:iCs/>
-          <w:sz w:val="22"/>
-          <w:szCs w:val="22"/>
-        </w:rPr>
-        <w:t xml:space="preserve">This is slide 38: the eval is the gate. That diff would have sailed through code review. The trajectory test blocks it.</w:t>
-      </w:r>
-    </w:p>
-    <w:p>
-      <w:pPr>
-        <w:spacing w:after="80" w:before="40" w:line="264"/>
-      </w:pPr>
-      <w:r>
-        <w:rPr>
-          <w:rFonts w:ascii="Calibri" w:cs="Calibri" w:eastAsia="Calibri" w:hAnsi="Calibri"/>
-          <w:b/>
-          <w:bCs/>
-          <w:i w:val="false"/>
-          <w:iCs w:val="false"/>
-          <w:color w:val="2BB3B1"/>
-          <w:sz w:val="20"/>
-          <w:szCs w:val="20"/>
-        </w:rPr>
-        <w:t xml:space="preserve">SAY  </w:t>
-      </w:r>
-      <w:r>
-        <w:rPr>
-          <w:rFonts w:ascii="Calibri" w:cs="Calibri" w:eastAsia="Calibri" w:hAnsi="Calibri"/>
-          <w:b w:val="false"/>
-          <w:bCs w:val="false"/>
-          <w:i/>
-          <w:iCs/>
-          <w:sz w:val="22"/>
-          <w:szCs w:val="22"/>
-        </w:rPr>
-        <w:t xml:space="preserve">Remember this change. It was a cost optimization. We'll come back to it in Module 6.</w:t>
-      </w:r>
-    </w:p>
-    <w:p>
-      <w:pPr>
-        <w:spacing w:after="40" w:before="40" w:line="264"/>
-      </w:pPr>
-      <w:r>
-        <w:rPr>
-          <w:rFonts w:ascii="Calibri" w:cs="Calibri" w:eastAsia="Calibri" w:hAnsi="Calibri"/>
-          <w:b/>
-          <w:bCs/>
-          <w:i w:val="false"/>
-          <w:iCs w:val="false"/>
-          <w:color w:val="B07CFF"/>
-          <w:sz w:val="22"/>
-          <w:szCs w:val="22"/>
-        </w:rPr>
-        <w:t xml:space="preserve">STATE  </w:t>
-      </w:r>
-      <w:r>
-        <w:rPr>
-          <w:rFonts w:ascii="Calibri" w:cs="Calibri" w:eastAsia="Calibri" w:hAnsi="Calibri"/>
-          <w:b/>
-          <w:bCs/>
-          <w:i w:val="false"/>
-          <w:iCs w:val="false"/>
-          <w:sz w:val="22"/>
-          <w:szCs w:val="22"/>
-        </w:rPr>
-        <w:t xml:space="preserve">Evalset in agent folder </w:t>
-      </w:r>
-      <w:r>
-        <w:rPr>
-          <w:rFonts w:ascii="Calibri" w:cs="Calibri" w:eastAsia="Calibri" w:hAnsi="Calibri"/>
-          <w:b/>
-          <w:bCs/>
-          <w:i w:val="false"/>
-          <w:iCs w:val="false"/>
-          <w:color w:val="2ECC71"/>
-          <w:sz w:val="22"/>
-          <w:szCs w:val="22"/>
-        </w:rPr>
-        <w:t xml:space="preserve">ON</w:t>
-      </w:r>
-    </w:p>
-    <w:p>
-      <w:pPr>
-        <w:spacing w:after="80" w:before="40" w:line="264"/>
-      </w:pPr>
-      <w:r>
-        <w:rPr>
-          <w:rFonts w:ascii="Calibri" w:cs="Calibri" w:eastAsia="Calibri" w:hAnsi="Calibri"/>
-          <w:b/>
-          <w:bCs/>
-          <w:i w:val="false"/>
-          <w:iCs w:val="false"/>
-          <w:color w:val="B07CFF"/>
-          <w:sz w:val="20"/>
-          <w:szCs w:val="20"/>
-        </w:rPr>
-        <w:t xml:space="preserve">NEEDS  </w:t>
-      </w:r>
-      <w:r>
-        <w:rPr>
-          <w:rFonts w:ascii="Calibri" w:cs="Calibri" w:eastAsia="Calibri" w:hAnsi="Calibri"/>
-          <w:b w:val="false"/>
-          <w:bCs w:val="false"/>
-          <w:i w:val="false"/>
-          <w:iCs w:val="false"/>
-          <w:sz w:val="20"/>
-          <w:szCs w:val="20"/>
-        </w:rPr>
-        <w:t xml:space="preserve">agentops_live from the previous block (or the fallback below).</w:t>
-      </w:r>
-    </w:p>
-    <w:p>
-      <w:pPr>
-        <w:spacing w:after="80" w:before="40" w:line="264"/>
-      </w:pPr>
-      <w:r>
-        <w:rPr>
-          <w:rFonts w:ascii="Calibri" w:cs="Calibri" w:eastAsia="Calibri" w:hAnsi="Calibri"/>
-          <w:b/>
-          <w:bCs/>
-          <w:i w:val="false"/>
-          <w:iCs w:val="false"/>
-          <w:color w:val="B07CFF"/>
-          <w:sz w:val="20"/>
-          <w:szCs w:val="20"/>
-        </w:rPr>
-        <w:t xml:space="preserve">FILES  </w:t>
-      </w:r>
-      <w:r>
-        <w:rPr>
-          <w:rFonts w:ascii="Calibri" w:cs="Calibri" w:eastAsia="Calibri" w:hAnsi="Calibri"/>
-          <w:b w:val="false"/>
-          <w:bCs w:val="false"/>
-          <w:i w:val="false"/>
-          <w:iCs w:val="false"/>
-          <w:color w:val="B07CFF"/>
-          <w:sz w:val="20"/>
-          <w:szCs w:val="20"/>
-        </w:rPr>
-        <w:t xml:space="preserve">04-evaluate/test_config.json   ·   04-evaluate/cost_tweak.sh   ·   04-evaluate/agentops_baseline.evalset.json</w:t>
       </w:r>
     </w:p>
     <w:tbl>
@@ -8703,7 +8395,7 @@
                 <w:sz w:val="19"/>
                 <w:szCs w:val="19"/>
               </w:rPr>
-              <w:t xml:space="preserve">cat ~/agentops/04-evaluate/test_config.json</w:t>
+              <w:t xml:space="preserve">cd ~/agentops &amp;&amp; python 04-evaluate/curate_evalset.py diabetes_agent/agentops_live.evalset.json</w:t>
             </w:r>
           </w:p>
           <w:p>
@@ -8734,7 +8426,7 @@
                 <w:sz w:val="19"/>
                 <w:szCs w:val="19"/>
               </w:rPr>
-              <w:t xml:space="preserve">tool_trajectory_avg_score: ANY_ORDER, ignore_args: true · rubric: the medical disclaimer</w:t>
+              <w:t xml:space="preserve">Per case: recorded path → expected: search_agent / execute_sql / execute_sql (original kept as agentops_live.recorded.json)</w:t>
             </w:r>
           </w:p>
         </w:tc>
@@ -8755,6 +8447,395 @@
           <w:szCs w:val="22"/>
         </w:rPr>
         <w:t xml:space="preserve"/>
+      </w:r>
+    </w:p>
+    <w:p>
+      <w:pPr>
+        <w:spacing w:after="80" w:before="40" w:line="264"/>
+      </w:pPr>
+      <w:r>
+        <w:rPr>
+          <w:rFonts w:ascii="Calibri" w:cs="Calibri" w:eastAsia="Calibri" w:hAnsi="Calibri"/>
+          <w:b w:val="false"/>
+          <w:bCs w:val="false"/>
+          <w:i w:val="false"/>
+          <w:iCs w:val="false"/>
+          <w:sz w:val="22"/>
+          <w:szCs w:val="22"/>
+        </w:rPr>
+        <w:t xml:space="preserve">The evalset lands in diabetes_agent/agentops_live.evalset.json (adk web keeps evalsets next to the agent). adk web records each turn as the full list of events (InvocationEvents): every tool call with its exact arguments, plus the final answer.</w:t>
+      </w:r>
+    </w:p>
+    <w:p>
+      <w:pPr>
+        <w:spacing w:after="80" w:before="40" w:line="264"/>
+      </w:pPr>
+      <w:r>
+        <w:rPr>
+          <w:rFonts w:ascii="Calibri" w:cs="Calibri" w:eastAsia="Calibri" w:hAnsi="Calibri"/>
+          <w:b w:val="false"/>
+          <w:bCs w:val="false"/>
+          <w:i w:val="false"/>
+          <w:iCs w:val="false"/>
+          <w:sz w:val="22"/>
+          <w:szCs w:val="22"/>
+        </w:rPr>
+        <w:t xml:space="preserve">How a run works: adk eval (or Run Evaluation in the Eval tab) replays each case's user messages against the agent as it is NOW, records what it does, and scores that against the recorded case with the chosen metrics. Nothing is cached; every run calls the model and BigQuery again.</w:t>
+      </w:r>
+    </w:p>
+    <w:p>
+      <w:pPr>
+        <w:spacing w:after="80" w:before="40" w:line="264"/>
+      </w:pPr>
+      <w:r>
+        <w:rPr>
+          <w:rFonts w:ascii="Calibri" w:cs="Calibri" w:eastAsia="Calibri" w:hAnsi="Calibri"/>
+          <w:b w:val="false"/>
+          <w:bCs w:val="false"/>
+          <w:i w:val="false"/>
+          <w:iCs w:val="false"/>
+          <w:sz w:val="22"/>
+          <w:szCs w:val="22"/>
+        </w:rPr>
+        <w:t xml:space="preserve">Why the Eval tab's Run Evaluation fails: its dialog only sets thresholds. tool_trajectory_avg_score then means EXACT match including arguments (the SQL text changes every run), and response_match_score is a ROUGE word-overlap of 0.8 against the recorded answer (a reworded answer scores 0.3-0.6). Both fail on a correct agent. The CLI with 04-evaluate/test_config.json uses ANY_ORDER + ignore_args and an LLM-judged rubric instead.</w:t>
+      </w:r>
+    </w:p>
+    <w:p>
+      <w:pPr>
+        <w:spacing w:after="80" w:before="40" w:line="264"/>
+      </w:pPr>
+      <w:r>
+        <w:rPr>
+          <w:rFonts w:ascii="Calibri" w:cs="Calibri" w:eastAsia="Calibri" w:hAnsi="Calibri"/>
+          <w:b w:val="false"/>
+          <w:bCs w:val="false"/>
+          <w:i w:val="false"/>
+          <w:iCs w:val="false"/>
+          <w:sz w:val="22"/>
+          <w:szCs w:val="22"/>
+        </w:rPr>
+        <w:t xml:space="preserve">curate_evalset.py keeps, per turn, the first of execute_sql / search_agent the agent called, and drops the rest of the recorded path. With ANY_ORDER and ignore_args that means: the case passes if the agent reached for the same kind of source, whatever else it did. The cost tweak flips the percentage question from execute_sql to search_agent, so that case fails and the others still pass.</w:t>
+      </w:r>
+    </w:p>
+    <w:p>
+      <w:pPr>
+        <w:spacing w:after="80" w:before="40" w:line="264"/>
+      </w:pPr>
+      <w:r>
+        <w:rPr>
+          <w:rFonts w:ascii="Calibri" w:cs="Calibri" w:eastAsia="Calibri" w:hAnsi="Calibri"/>
+          <w:b w:val="false"/>
+          <w:bCs w:val="false"/>
+          <w:i w:val="false"/>
+          <w:iCs w:val="false"/>
+          <w:sz w:val="22"/>
+          <w:szCs w:val="22"/>
+        </w:rPr>
+        <w:t xml:space="preserve">Slide 33's advice applies: these three are happy-path cases. Real evalsets add edge cases and the failures you find in production.</w:t>
+      </w:r>
+    </w:p>
+    <w:p>
+      <w:pPr>
+        <w:spacing w:after="80" w:before="40" w:line="264"/>
+      </w:pPr>
+      <w:r>
+        <w:rPr>
+          <w:rFonts w:ascii="Calibri" w:cs="Calibri" w:eastAsia="Calibri" w:hAnsi="Calibri"/>
+          <w:b/>
+          <w:bCs/>
+          <w:i w:val="false"/>
+          <w:iCs w:val="false"/>
+          <w:color w:val="FF5C5C"/>
+          <w:sz w:val="20"/>
+          <w:szCs w:val="20"/>
+        </w:rPr>
+        <w:t xml:space="preserve">GOTCHA  </w:t>
+      </w:r>
+      <w:r>
+        <w:rPr>
+          <w:rFonts w:ascii="Calibri" w:cs="Calibri" w:eastAsia="Calibri" w:hAnsi="Calibri"/>
+          <w:b w:val="false"/>
+          <w:bCs w:val="false"/>
+          <w:i w:val="false"/>
+          <w:iCs w:val="false"/>
+          <w:sz w:val="20"/>
+          <w:szCs w:val="20"/>
+        </w:rPr>
+        <w:t xml:space="preserve">Don't press Run Evaluation in the Eval tab: its defaults (exact tool args + 0.8 text match) fail on any re-run. No Eval tab? Use the fallback evalset in the next block.</w:t>
+      </w:r>
+    </w:p>
+    <w:p>
+      <w:pPr>
+        <w:pStyle w:val="Heading3"/>
+        <w:keepNext/>
+        <w:spacing w:after="40" w:before="160"/>
+      </w:pPr>
+      <w:r>
+        <w:rPr>
+          <w:rFonts w:ascii="Calibri" w:cs="Calibri" w:eastAsia="Calibri" w:hAnsi="Calibri"/>
+          <w:b/>
+          <w:bCs/>
+          <w:i w:val="false"/>
+          <w:iCs w:val="false"/>
+          <w:color w:val="3D8BFF"/>
+          <w:sz w:val="22"/>
+          <w:szCs w:val="22"/>
+        </w:rPr>
+        <w:t xml:space="preserve">5. Run it, then let it catch a 'harmless' prompt edit   ·   M4 · SLIDES 35–38   ·   ~8 min</w:t>
+      </w:r>
+    </w:p>
+    <w:p>
+      <w:pPr>
+        <w:spacing w:after="80" w:before="40" w:line="264"/>
+      </w:pPr>
+      <w:r>
+        <w:rPr>
+          <w:rFonts w:ascii="Calibri" w:cs="Calibri" w:eastAsia="Calibri" w:hAnsi="Calibri"/>
+          <w:b/>
+          <w:bCs/>
+          <w:i w:val="false"/>
+          <w:iCs w:val="false"/>
+          <w:color w:val="2ECC71"/>
+          <w:sz w:val="20"/>
+          <w:szCs w:val="20"/>
+        </w:rPr>
+        <w:t xml:space="preserve">WHY  </w:t>
+      </w:r>
+      <w:r>
+        <w:rPr>
+          <w:rFonts w:ascii="Calibri" w:cs="Calibri" w:eastAsia="Calibri" w:hAnsi="Calibri"/>
+          <w:b w:val="false"/>
+          <w:bCs w:val="false"/>
+          <w:i w:val="false"/>
+          <w:iCs w:val="false"/>
+          <w:sz w:val="22"/>
+          <w:szCs w:val="22"/>
+        </w:rPr>
+        <w:t xml:space="preserve">Monday takeaway: a prompt is code. A one-paragraph change can reroute tools, and only an eval that checks the trajectory will notice. That eval is the gate on slide 38.</w:t>
+      </w:r>
+    </w:p>
+    <w:p>
+      <w:pPr>
+        <w:spacing w:after="80" w:before="40" w:line="264"/>
+      </w:pPr>
+      <w:r>
+        <w:rPr>
+          <w:rFonts w:ascii="Calibri" w:cs="Calibri" w:eastAsia="Calibri" w:hAnsi="Calibri"/>
+          <w:b/>
+          <w:bCs/>
+          <w:i w:val="false"/>
+          <w:iCs w:val="false"/>
+          <w:color w:val="2BB3B1"/>
+          <w:sz w:val="20"/>
+          <w:szCs w:val="20"/>
+        </w:rPr>
+        <w:t xml:space="preserve">SAY  </w:t>
+      </w:r>
+      <w:r>
+        <w:rPr>
+          <w:rFonts w:ascii="Calibri" w:cs="Calibri" w:eastAsia="Calibri" w:hAnsi="Calibri"/>
+          <w:b w:val="false"/>
+          <w:bCs w:val="false"/>
+          <w:i/>
+          <w:iCs/>
+          <w:sz w:val="22"/>
+          <w:szCs w:val="22"/>
+        </w:rPr>
+        <w:t xml:space="preserve">The default trajectory check compares tool arguments exactly. Our agent writes its own SQL, so the text changes run to run. I check the tool names in any order and ignore the arguments, and I add one rubric an LLM judge scores: did it give the medical disclaimer.</w:t>
+      </w:r>
+    </w:p>
+    <w:p>
+      <w:pPr>
+        <w:spacing w:after="80" w:before="40" w:line="264"/>
+      </w:pPr>
+      <w:r>
+        <w:rPr>
+          <w:rFonts w:ascii="Calibri" w:cs="Calibri" w:eastAsia="Calibri" w:hAnsi="Calibri"/>
+          <w:b/>
+          <w:bCs/>
+          <w:i w:val="false"/>
+          <w:iCs w:val="false"/>
+          <w:color w:val="2BB3B1"/>
+          <w:sz w:val="20"/>
+          <w:szCs w:val="20"/>
+        </w:rPr>
+        <w:t xml:space="preserve">SAY  </w:t>
+      </w:r>
+      <w:r>
+        <w:rPr>
+          <w:rFonts w:ascii="Calibri" w:cs="Calibri" w:eastAsia="Calibri" w:hAnsi="Calibri"/>
+          <w:b w:val="false"/>
+          <w:bCs w:val="false"/>
+          <w:i/>
+          <w:iCs/>
+          <w:sz w:val="22"/>
+          <w:szCs w:val="22"/>
+        </w:rPr>
+        <w:t xml:space="preserve">Now a teammate saves us money: BigQuery costs something on every call, so they tell the agent to answer statistics from search. Look at the diff. Would you have approved it?</w:t>
+      </w:r>
+    </w:p>
+    <w:p>
+      <w:pPr>
+        <w:spacing w:after="80" w:before="40" w:line="264"/>
+      </w:pPr>
+      <w:r>
+        <w:rPr>
+          <w:rFonts w:ascii="Calibri" w:cs="Calibri" w:eastAsia="Calibri" w:hAnsi="Calibri"/>
+          <w:b/>
+          <w:bCs/>
+          <w:i w:val="false"/>
+          <w:iCs w:val="false"/>
+          <w:color w:val="2BB3B1"/>
+          <w:sz w:val="20"/>
+          <w:szCs w:val="20"/>
+        </w:rPr>
+        <w:t xml:space="preserve">SAY  </w:t>
+      </w:r>
+      <w:r>
+        <w:rPr>
+          <w:rFonts w:ascii="Calibri" w:cs="Calibri" w:eastAsia="Calibri" w:hAnsi="Calibri"/>
+          <w:b w:val="false"/>
+          <w:bCs w:val="false"/>
+          <w:i/>
+          <w:iCs/>
+          <w:sz w:val="22"/>
+          <w:szCs w:val="22"/>
+        </w:rPr>
+        <w:t xml:space="preserve">This is slide 38: the eval is the gate. That diff would have sailed through code review. The trajectory test blocks it.</w:t>
+      </w:r>
+    </w:p>
+    <w:p>
+      <w:pPr>
+        <w:spacing w:after="80" w:before="40" w:line="264"/>
+      </w:pPr>
+      <w:r>
+        <w:rPr>
+          <w:rFonts w:ascii="Calibri" w:cs="Calibri" w:eastAsia="Calibri" w:hAnsi="Calibri"/>
+          <w:b/>
+          <w:bCs/>
+          <w:i w:val="false"/>
+          <w:iCs w:val="false"/>
+          <w:color w:val="2BB3B1"/>
+          <w:sz w:val="20"/>
+          <w:szCs w:val="20"/>
+        </w:rPr>
+        <w:t xml:space="preserve">SAY  </w:t>
+      </w:r>
+      <w:r>
+        <w:rPr>
+          <w:rFonts w:ascii="Calibri" w:cs="Calibri" w:eastAsia="Calibri" w:hAnsi="Calibri"/>
+          <w:b w:val="false"/>
+          <w:bCs w:val="false"/>
+          <w:i/>
+          <w:iCs/>
+          <w:sz w:val="22"/>
+          <w:szCs w:val="22"/>
+        </w:rPr>
+        <w:t xml:space="preserve">Remember this change. It was a cost optimization. We'll come back to it in Module 6.</w:t>
+      </w:r>
+    </w:p>
+    <w:p>
+      <w:pPr>
+        <w:spacing w:after="40" w:before="40" w:line="264"/>
+      </w:pPr>
+      <w:r>
+        <w:rPr>
+          <w:rFonts w:ascii="Calibri" w:cs="Calibri" w:eastAsia="Calibri" w:hAnsi="Calibri"/>
+          <w:b/>
+          <w:bCs/>
+          <w:i w:val="false"/>
+          <w:iCs w:val="false"/>
+          <w:color w:val="B07CFF"/>
+          <w:sz w:val="22"/>
+          <w:szCs w:val="22"/>
+        </w:rPr>
+        <w:t xml:space="preserve">STATE  </w:t>
+      </w:r>
+      <w:r>
+        <w:rPr>
+          <w:rFonts w:ascii="Calibri" w:cs="Calibri" w:eastAsia="Calibri" w:hAnsi="Calibri"/>
+          <w:b/>
+          <w:bCs/>
+          <w:i w:val="false"/>
+          <w:iCs w:val="false"/>
+          <w:sz w:val="22"/>
+          <w:szCs w:val="22"/>
+        </w:rPr>
+        <w:t xml:space="preserve">Evalset in agent folder </w:t>
+      </w:r>
+      <w:r>
+        <w:rPr>
+          <w:rFonts w:ascii="Calibri" w:cs="Calibri" w:eastAsia="Calibri" w:hAnsi="Calibri"/>
+          <w:b/>
+          <w:bCs/>
+          <w:i w:val="false"/>
+          <w:iCs w:val="false"/>
+          <w:color w:val="2ECC71"/>
+          <w:sz w:val="22"/>
+          <w:szCs w:val="22"/>
+        </w:rPr>
+        <w:t xml:space="preserve">ON</w:t>
+      </w:r>
+    </w:p>
+    <w:p>
+      <w:pPr>
+        <w:spacing w:after="80" w:before="40" w:line="264"/>
+      </w:pPr>
+      <w:r>
+        <w:rPr>
+          <w:rFonts w:ascii="Calibri" w:cs="Calibri" w:eastAsia="Calibri" w:hAnsi="Calibri"/>
+          <w:b/>
+          <w:bCs/>
+          <w:i w:val="false"/>
+          <w:iCs w:val="false"/>
+          <w:color w:val="B07CFF"/>
+          <w:sz w:val="20"/>
+          <w:szCs w:val="20"/>
+        </w:rPr>
+        <w:t xml:space="preserve">NEEDS  </w:t>
+      </w:r>
+      <w:r>
+        <w:rPr>
+          <w:rFonts w:ascii="Calibri" w:cs="Calibri" w:eastAsia="Calibri" w:hAnsi="Calibri"/>
+          <w:b w:val="false"/>
+          <w:bCs w:val="false"/>
+          <w:i w:val="false"/>
+          <w:iCs w:val="false"/>
+          <w:sz w:val="20"/>
+          <w:szCs w:val="20"/>
+        </w:rPr>
+        <w:t xml:space="preserve">agentops_live from the previous block (or the fallback below).</w:t>
+      </w:r>
+    </w:p>
+    <w:p>
+      <w:pPr>
+        <w:spacing w:after="80" w:before="40" w:line="264"/>
+      </w:pPr>
+      <w:r>
+        <w:rPr>
+          <w:rFonts w:ascii="Calibri" w:cs="Calibri" w:eastAsia="Calibri" w:hAnsi="Calibri"/>
+          <w:b/>
+          <w:bCs/>
+          <w:i w:val="false"/>
+          <w:iCs w:val="false"/>
+          <w:color w:val="B07CFF"/>
+          <w:sz w:val="20"/>
+          <w:szCs w:val="20"/>
+        </w:rPr>
+        <w:t xml:space="preserve">FILES  </w:t>
+      </w:r>
+      <w:r>
+        <w:rPr>
+          <w:rFonts w:ascii="Calibri" w:cs="Calibri" w:eastAsia="Calibri" w:hAnsi="Calibri"/>
+          <w:b w:val="false"/>
+          <w:bCs w:val="false"/>
+          <w:i w:val="false"/>
+          <w:iCs w:val="false"/>
+          <w:color w:val="B07CFF"/>
+          <w:sz w:val="20"/>
+          <w:szCs w:val="20"/>
+        </w:rPr>
+        <w:t xml:space="preserve">04-evaluate/test_config.json   ·   04-evaluate/cost_tweak.sh   ·   04-evaluate/agentops_baseline.evalset.json</w:t>
       </w:r>
     </w:p>
     <w:tbl>
@@ -8824,24 +8905,7 @@
                 <w:sz w:val="19"/>
                 <w:szCs w:val="19"/>
               </w:rPr>
-              <w:t xml:space="preserve">cd ~/agentops &amp;&amp; adk eval diabetes_agent diabetes_agent/agentops_live.evalset.json \</w:t>
-            </w:r>
-          </w:p>
-          <w:p>
-            <w:pPr>
-              <w:spacing w:after="0" w:before="0" w:line="264"/>
-            </w:pPr>
-            <w:r>
-              <w:rPr>
-                <w:rFonts w:ascii="Consolas" w:cs="Consolas" w:eastAsia="Consolas" w:hAnsi="Consolas"/>
-                <w:b w:val="false"/>
-                <w:bCs w:val="false"/>
-                <w:i w:val="false"/>
-                <w:iCs w:val="false"/>
-                <w:sz w:val="19"/>
-                <w:szCs w:val="19"/>
-              </w:rPr>
-              <w:t xml:space="preserve">  --config_file_path 04-evaluate/test_config.json --print_detailed_results</w:t>
+              <w:t xml:space="preserve">cat ~/agentops/04-evaluate/test_config.json</w:t>
             </w:r>
           </w:p>
           <w:p>
@@ -8872,7 +8936,145 @@
                 <w:sz w:val="19"/>
                 <w:szCs w:val="19"/>
               </w:rPr>
-              <w:t xml:space="preserve">3 passed, 0 failed (≈1–2 min). SAY: now a teammate saves us money.</w:t>
+              <w:t xml:space="preserve">tool_trajectory_avg_score: ANY_ORDER, ignore_args: true · rubric: the medical disclaimer</w:t>
+            </w:r>
+          </w:p>
+        </w:tc>
+      </w:tr>
+    </w:tbl>
+    <w:p>
+      <w:pPr>
+        <w:spacing w:after="20" w:before="0" w:line="264"/>
+      </w:pPr>
+      <w:r>
+        <w:rPr>
+          <w:rFonts w:ascii="Calibri" w:cs="Calibri" w:eastAsia="Calibri" w:hAnsi="Calibri"/>
+          <w:b w:val="false"/>
+          <w:bCs w:val="false"/>
+          <w:i w:val="false"/>
+          <w:iCs w:val="false"/>
+          <w:sz w:val="22"/>
+          <w:szCs w:val="22"/>
+        </w:rPr>
+        <w:t xml:space="preserve"/>
+      </w:r>
+    </w:p>
+    <w:tbl>
+      <w:tblPr>
+        <w:tblW w:type="dxa" w:w="10080"/>
+        <w:tblBorders>
+          <w:top w:val="single" w:color="auto" w:sz="4"/>
+          <w:left w:val="single" w:color="auto" w:sz="4"/>
+          <w:bottom w:val="single" w:color="auto" w:sz="4"/>
+          <w:right w:val="single" w:color="auto" w:sz="4"/>
+          <w:insideH w:val="single" w:color="auto" w:sz="4"/>
+          <w:insideV w:val="single" w:color="auto" w:sz="4"/>
+        </w:tblBorders>
+      </w:tblPr>
+      <w:tblGrid>
+        <w:gridCol w:w="10080"/>
+      </w:tblGrid>
+      <w:tr>
+        <w:trPr>
+          <w:cantSplit/>
+        </w:trPr>
+        <w:tc>
+          <w:tcPr>
+            <w:tcW w:type="dxa" w:w="10080"/>
+            <w:tcBorders>
+              <w:top w:val="single" w:color="2BB3B1" w:sz="12"/>
+              <w:left w:val="single" w:color="2BB3B1" w:sz="36"/>
+              <w:bottom w:val="single" w:color="2BB3B1" w:sz="12"/>
+              <w:right w:val="single" w:color="2BB3B1" w:sz="12"/>
+            </w:tcBorders>
+            <w:tcMar>
+              <w:top w:type="dxa" w:w="80"/>
+              <w:left w:type="dxa" w:w="160"/>
+              <w:bottom w:type="dxa" w:w="80"/>
+              <w:right w:type="dxa" w:w="160"/>
+            </w:tcMar>
+          </w:tcPr>
+          <w:p>
+            <w:pPr>
+              <w:spacing w:after="40" w:before="0" w:line="264"/>
+            </w:pPr>
+            <w:r>
+              <w:rPr>
+                <w:rFonts w:ascii="Calibri" w:cs="Calibri" w:eastAsia="Calibri" w:hAnsi="Calibri"/>
+                <w:b/>
+                <w:bCs/>
+                <w:i w:val="false"/>
+                <w:iCs w:val="false"/>
+                <w:color w:val="2BB3B1"/>
+                <w:sz w:val="18"/>
+                <w:szCs w:val="18"/>
+              </w:rPr>
+              <w:t xml:space="preserve">CLOUD SHELL · TAB 2</w:t>
+            </w:r>
+          </w:p>
+          <w:p>
+            <w:pPr>
+              <w:spacing w:after="0" w:before="0" w:line="264"/>
+            </w:pPr>
+            <w:r>
+              <w:rPr>
+                <w:rFonts w:ascii="Consolas" w:cs="Consolas" w:eastAsia="Consolas" w:hAnsi="Consolas"/>
+                <w:b w:val="false"/>
+                <w:bCs w:val="false"/>
+                <w:i w:val="false"/>
+                <w:iCs w:val="false"/>
+                <w:sz w:val="19"/>
+                <w:szCs w:val="19"/>
+              </w:rPr>
+              <w:t xml:space="preserve">cd ~/agentops &amp;&amp; adk eval diabetes_agent diabetes_agent/agentops_live.evalset.json \</w:t>
+            </w:r>
+          </w:p>
+          <w:p>
+            <w:pPr>
+              <w:spacing w:after="0" w:before="0" w:line="264"/>
+            </w:pPr>
+            <w:r>
+              <w:rPr>
+                <w:rFonts w:ascii="Consolas" w:cs="Consolas" w:eastAsia="Consolas" w:hAnsi="Consolas"/>
+                <w:b w:val="false"/>
+                <w:bCs w:val="false"/>
+                <w:i w:val="false"/>
+                <w:iCs w:val="false"/>
+                <w:sz w:val="19"/>
+                <w:szCs w:val="19"/>
+              </w:rPr>
+              <w:t xml:space="preserve">  --config_file_path 04-evaluate/test_config.json --print_detailed_results</w:t>
+            </w:r>
+          </w:p>
+          <w:p>
+            <w:pPr>
+              <w:spacing w:after="0" w:before="60" w:line="264"/>
+            </w:pPr>
+            <w:r>
+              <w:rPr>
+                <w:rFonts w:ascii="Calibri" w:cs="Calibri" w:eastAsia="Calibri" w:hAnsi="Calibri"/>
+                <w:b/>
+                <w:bCs/>
+                <w:i w:val="false"/>
+                <w:iCs w:val="false"/>
+                <w:color w:val="2ECC71"/>
+                <w:sz w:val="19"/>
+                <w:szCs w:val="19"/>
+              </w:rPr>
+              <w:t xml:space="preserve">→ </w:t>
+            </w:r>
+            <w:r>
+              <w:rPr>
+                <w:rFonts w:ascii="Calibri" w:cs="Calibri" w:eastAsia="Calibri" w:hAnsi="Calibri"/>
+                <w:b w:val="false"/>
+                <w:bCs w:val="false"/>
+                <w:i w:val="false"/>
+                <w:iCs w:val="false"/>
+                <w:color w:val="9AA4B2"/>
+                <w:sz w:val="19"/>
+                <w:szCs w:val="19"/>
+              </w:rPr>
+              <w:t xml:space="preserve">3 passed, 0 failed (≈2–3 min): trajectory 1.0 and the disclaimer rubric on each case. SAY: now a teammate saves us money.</w:t>
             </w:r>
           </w:p>
         </w:tc>

</xml_diff>